<commit_message>
update to make the code work
</commit_message>
<xml_diff>
--- a/docs/outline.docx
+++ b/docs/outline.docx
@@ -637,7 +637,7 @@
         <w:rPr>
           <w:rtl w:val="0"/>
         </w:rPr>
-        <w:t xml:space="preserve">Tái lập DLinear bằng SGD, MSE 0.3779 so với 0.375 công bố (lệch 0.8%). (xong)</w:t>
+        <w:t xml:space="preserve">Tái lập DLinear bằng SGD, MSE 0.3766 so với 0.375 công bố (lệch 0.4%). (xong)</w:t>
       </w:r>
     </w:p>
     <w:p>
@@ -685,7 +685,7 @@
         <w:rPr>
           <w:rtl w:val="0"/>
         </w:rPr>
-        <w:t xml:space="preserve">OLS dạng đóng trên ETTh1 H=96: MSE test 0.3702, tốt hơn DLinear SGD (0.3779) khoảng 2%. (xong)</w:t>
+        <w:t xml:space="preserve">OLS dạng đóng trên ETTh1 H=96: MSE test 0.3702, tốt hơn DLinear SGD (0.3766) khoảng 1.7%. (xong)</w:t>
       </w:r>
     </w:p>
     <w:p>

</xml_diff>